<commit_message>
fix(acta_inicio): supervisor y contratista ahora se toman del contrato
La plantilla acta_inicio.docx tenía nombres hardcodeados en
las líneas de firma. Se reemplazaron por <<SUPERVISOR>> y
<<CONTRATISTA>> para que se tomen automáticamente de los
datos del contrato.
</commit_message>
<xml_diff>
--- a/backend/app/templates/acta_inicio.docx
+++ b/backend/app/templates/acta_inicio.docx
@@ -1358,7 +1358,7 @@
           <w:szCs w:val="24"/>
           <w:lang w:val="pt-BR"/>
         </w:rPr>
-        <w:t>CARLOS ALBERTO VIAFARA ARACU                                                     RIVERA BRAVA S.A.S</w:t>
+        <w:t>&lt;&lt;SUPERVISOR&gt;&gt;                                                     &lt;&lt;CONTRATISTA&gt;&gt;</w:t>
       </w:r>
       <w:r>
         <w:rPr>
@@ -1389,7 +1389,7 @@
           <w:szCs w:val="24"/>
           <w:lang w:val="pt-BR"/>
         </w:rPr>
-        <w:t>Supervisor                                                                                                            RL- HAROLD RIVERA RIASCOS</w:t>
+        <w:t>Supervisor                                                                                                            &lt;&lt;CONTRATISTA&gt;&gt;</w:t>
       </w:r>
     </w:p>
     <w:sectPr>

</xml_diff>